<commit_message>
docs(backlog): requalification item #K1 criar-conta — partiellement livre
</commit_message>
<xml_diff>
--- a/docs/backlogs/AnarBib-Backlog-2026-05-21-v9.docx
+++ b/docs/backlogs/AnarBib-Backlog-2026-05-21-v9.docx
@@ -11922,7 +11922,7 @@
         <w:t xml:space="preserve">Statut : </w:t>
       </w:r>
       <w:r>
-        <w:t>🟢 PRÊT</w:t>
+        <w:t>🟡 PARTIELLEMENT LIVRÉ</w:t>
       </w:r>
     </w:p>
     <w:p>
@@ -11937,7 +11937,7 @@
         <w:t xml:space="preserve">Estimation : </w:t>
       </w:r>
       <w:r>
-        <w:t>1 session (4-5h) — paquets 1+2 DB+EF, puis 1 session frontend</w:t>
+        <w:t>Reste ~2 sessions : paquets 1+2 (DB profiles.signup_intent + EF register) puis paquet 4 (frontend select 3 cas), + paquets 6/7/8</w:t>
       </w:r>
     </w:p>
     <w:p>
@@ -11952,7 +11952,7 @@
         <w:t xml:space="preserve">Notes : </w:t>
       </w:r>
       <w:r>
-        <w:t>Cas Karina (18/05). Spec rédigée le 20/05, 9 paquets dont DB → EF → /explorar → frontend → i18n → mail → privacy/conta → tests E2E → régularisation. signup_intent enum sur profiles.</w:t>
+        <w:t>Cas Karina (18/05). Spec v0.2 rédigée le 20/05 (docs/specs/spec-onboarding-criar-conta.md), 9 paquets. PARTIELLEMENT LIVRÉ au 21/05 : le bandeau vitrine (Bloc A, forme minimale) et le lien /explorar sont faits ; le paquet 3 (route /explorar provisoire en prose) est DÉPASSÉ — remplacé par la galerie complète #K2 sur anarbib.org (arbitrage D7 absorbé). NON LIVRÉ : paquet 1 (migration profiles.signup_intent, 3 colonnes + CHECK + RPC fn_clear_my_signup_metadata_field), paquet 2 (refonte EF register, switch sur 3 intents), paquet 4 (refactor du select en 3 cas — biblio active / nouvelle biblio / lectrice orpheline ; sentinelle __solicitar__ encore en place), paquet 6 (mail welcome-reader-orphan), paquet 7 (privacy notice + exposition /conta), paquet 8 (tests E2E). À RELIRE À FROID avant exécution : décider si la spec reste en v0.2 ou passe en v0.3 — la galerie livrée change le contexte du Bloc A et du paquet 3 (nommage i18n déjà divergent : showcase.link posé vs showcase.exploreCta prévu). Cœur restant = refactor select 3 cas + signup_intent (c'est ce qui répond vraiment au cas Karina).</w:t>
       </w:r>
     </w:p>
     <w:p>
@@ -14971,7 +14971,7 @@
         <w:t xml:space="preserve">Session 2 </w:t>
       </w:r>
       <w:r>
-        <w:t>— Paquets 3+4 (route /explorar provisoire + frontend CriarContaPage). ~3-4h.</w:t>
+        <w:t>— Paquet 4 (frontend CriarContaPage : refactor du select en 3 cas). Le paquet 3 (route /explorar provisoire) est dépassé par la galerie #K2. ~2-3h.</w:t>
       </w:r>
     </w:p>
     <w:p>

</xml_diff>